<commit_message>
docs(estates): add Rawdon walkthrough guide
</commit_message>
<xml_diff>
--- a/docs/modules/estates-compliance/customer-guide/Schoolgle Estates Management Customer Guide.docx
+++ b/docs/modules/estates-compliance/customer-guide/Schoolgle Estates Management Customer Guide.docx
@@ -26,41 +26,31 @@
         <w:t>Assets · Contractors · Compliance Checks · Tickets · Evidence</w:t>
       </w:r>
     </w:p>
-    <w:tbl>
-      <w:tblPr>
-        <w:tblW w:type="auto" w:w="0"/>
-        <w:tblLayout w:type="fixed"/>
-        <w:tblLook w:firstColumn="1" w:firstRow="1" w:lastColumn="0" w:lastRow="0" w:noHBand="0" w:noVBand="1" w:val="04A0"/>
-      </w:tblPr>
-      <w:tblGrid>
-        <w:gridCol w:w="9360"/>
-      </w:tblGrid>
-      <w:tr>
-        <w:tc>
-          <w:tcPr>
-            <w:tcW w:type="dxa" w:w="9360"/>
-            <w:shd w:fill="E8EEF5"/>
-          </w:tcPr>
-          <w:p>
-            <w:pPr>
-              <w:spacing w:after="80"/>
-            </w:pPr>
-            <w:r>
-              <w:rPr>
-                <w:b/>
-                <w:color w:val="0B2545"/>
-              </w:rPr>
-              <w:t>Purpose</w:t>
-            </w:r>
-            <w:r>
-              <w:br/>
-              <w:t>This guide explains how a school uses Estates Management to keep assets, contractors, inspections, tickets, tasks, warranties and evidence connected in one audit trail.</w:t>
-            </w:r>
-          </w:p>
-        </w:tc>
-      </w:tr>
-    </w:tbl>
-    <w:p/>
+    <w:p>
+      <w:pPr>
+        <w:keepLines/>
+        <w:spacing w:before="120" w:after="200"/>
+        <w:ind w:left="72" w:right="72"/>
+        <w:shd w:fill="E8EEF5"/>
+        <w:pBdr>
+          <w:top w:val="single" w:sz="6" w:space="8" w:color="D0D7DE"/>
+          <w:left w:val="single" w:sz="6" w:space="8" w:color="D0D7DE"/>
+          <w:bottom w:val="single" w:sz="6" w:space="8" w:color="D0D7DE"/>
+          <w:right w:val="single" w:sz="6" w:space="8" w:color="D0D7DE"/>
+        </w:pBdr>
+      </w:pPr>
+      <w:r>
+        <w:rPr>
+          <w:b/>
+          <w:color w:val="0B2545"/>
+        </w:rPr>
+        <w:t>Purpose</w:t>
+      </w:r>
+      <w:r>
+        <w:br/>
+        <w:t>This guide explains how a school uses Estates Management to keep assets, contractors, inspections, tickets, tasks, warranties and evidence connected in one audit trail.</w:t>
+      </w:r>
+    </w:p>
     <w:p>
       <w:pPr>
         <w:pStyle w:val="Heading1"/>
@@ -129,11 +119,14 @@
       </w:r>
     </w:p>
     <w:p>
+      <w:pPr>
+        <w:keepNext/>
+      </w:pPr>
       <w:r>
         <w:drawing>
           <wp:inline xmlns:a="http://schemas.openxmlformats.org/drawingml/2006/main" xmlns:pic="http://schemas.openxmlformats.org/drawingml/2006/picture">
             <wp:extent cx="5943600" cy="4127500"/>
-            <wp:docPr id="1" name="Picture 1"/>
+            <wp:docPr id="1" name="Picture 1" descr="Compliance check with linked assets, tickets, tasks and completion history." title="Compliance check with linked assets, tickets, tasks and completion history."/>
             <wp:cNvGraphicFramePr>
               <a:graphicFrameLocks noChangeAspect="1"/>
             </wp:cNvGraphicFramePr>
@@ -166,6 +159,7 @@
     </w:p>
     <w:p>
       <w:pPr>
+        <w:spacing w:after="160"/>
         <w:jc w:val="center"/>
       </w:pPr>
       <w:r>
@@ -191,6 +185,10 @@
     <w:p>
       <w:pPr>
         <w:pStyle w:val="ListNumber"/>
+        <w:numPr>
+          <w:ilvl w:val="0"/>
+          <w:numId w:val="10"/>
+        </w:numPr>
         <w:spacing w:after="80" w:line="300" w:lineRule="auto"/>
         <w:ind w:left="540" w:hanging="271"/>
       </w:pPr>
@@ -201,6 +199,10 @@
     <w:p>
       <w:pPr>
         <w:pStyle w:val="ListNumber"/>
+        <w:numPr>
+          <w:ilvl w:val="0"/>
+          <w:numId w:val="10"/>
+        </w:numPr>
         <w:spacing w:after="80" w:line="300" w:lineRule="auto"/>
         <w:ind w:left="540" w:hanging="271"/>
       </w:pPr>
@@ -211,6 +213,10 @@
     <w:p>
       <w:pPr>
         <w:pStyle w:val="ListNumber"/>
+        <w:numPr>
+          <w:ilvl w:val="0"/>
+          <w:numId w:val="10"/>
+        </w:numPr>
         <w:spacing w:after="80" w:line="300" w:lineRule="auto"/>
         <w:ind w:left="540" w:hanging="271"/>
       </w:pPr>
@@ -221,6 +227,10 @@
     <w:p>
       <w:pPr>
         <w:pStyle w:val="ListNumber"/>
+        <w:numPr>
+          <w:ilvl w:val="0"/>
+          <w:numId w:val="10"/>
+        </w:numPr>
         <w:spacing w:after="80" w:line="300" w:lineRule="auto"/>
         <w:ind w:left="540" w:hanging="271"/>
       </w:pPr>
@@ -231,6 +241,10 @@
     <w:p>
       <w:pPr>
         <w:pStyle w:val="ListNumber"/>
+        <w:numPr>
+          <w:ilvl w:val="0"/>
+          <w:numId w:val="10"/>
+        </w:numPr>
         <w:spacing w:after="80" w:line="300" w:lineRule="auto"/>
         <w:ind w:left="540" w:hanging="271"/>
       </w:pPr>
@@ -241,6 +255,10 @@
     <w:p>
       <w:pPr>
         <w:pStyle w:val="ListNumber"/>
+        <w:numPr>
+          <w:ilvl w:val="0"/>
+          <w:numId w:val="10"/>
+        </w:numPr>
         <w:spacing w:after="80" w:line="300" w:lineRule="auto"/>
         <w:ind w:left="540" w:hanging="271"/>
       </w:pPr>
@@ -251,6 +269,10 @@
     <w:p>
       <w:pPr>
         <w:pStyle w:val="ListNumber"/>
+        <w:numPr>
+          <w:ilvl w:val="0"/>
+          <w:numId w:val="10"/>
+        </w:numPr>
         <w:spacing w:after="80" w:line="300" w:lineRule="auto"/>
         <w:ind w:left="540" w:hanging="271"/>
       </w:pPr>
@@ -259,11 +281,14 @@
       </w:r>
     </w:p>
     <w:p>
+      <w:pPr>
+        <w:keepNext/>
+      </w:pPr>
       <w:r>
         <w:drawing>
           <wp:inline xmlns:a="http://schemas.openxmlformats.org/drawingml/2006/main" xmlns:pic="http://schemas.openxmlformats.org/drawingml/2006/picture">
             <wp:extent cx="5943600" cy="4127500"/>
-            <wp:docPr id="2" name="Picture 2"/>
+            <wp:docPr id="2" name="Picture 2" descr="Add Asset form showing purchase, warranty and contractor fields." title="Add Asset form showing purchase, warranty and contractor fields."/>
             <wp:cNvGraphicFramePr>
               <a:graphicFrameLocks noChangeAspect="1"/>
             </wp:cNvGraphicFramePr>
@@ -296,6 +321,7 @@
     </w:p>
     <w:p>
       <w:pPr>
+        <w:spacing w:after="160"/>
         <w:jc w:val="center"/>
       </w:pPr>
       <w:r>
@@ -307,11 +333,96 @@
       </w:r>
     </w:p>
     <w:p>
+      <w:pPr>
+        <w:pStyle w:val="Heading1"/>
+      </w:pPr>
+      <w:r>
+        <w:rPr>
+          <w:rFonts w:ascii="Calibri" w:hAnsi="Calibri"/>
+          <w:color w:val="2E74B5"/>
+        </w:rPr>
+        <w:t>3. Add a Contractor</w:t>
+      </w:r>
+    </w:p>
+    <w:p>
+      <w:pPr>
+        <w:pStyle w:val="ListNumber"/>
+        <w:numPr>
+          <w:ilvl w:val="0"/>
+          <w:numId w:val="11"/>
+        </w:numPr>
+        <w:spacing w:after="80" w:line="300" w:lineRule="auto"/>
+        <w:ind w:left="540" w:hanging="271"/>
+      </w:pPr>
+      <w:r>
+        <w:t>Open Estates → Contractors.</w:t>
+      </w:r>
+    </w:p>
+    <w:p>
+      <w:pPr>
+        <w:pStyle w:val="ListNumber"/>
+        <w:numPr>
+          <w:ilvl w:val="0"/>
+          <w:numId w:val="11"/>
+        </w:numPr>
+        <w:spacing w:after="80" w:line="300" w:lineRule="auto"/>
+        <w:ind w:left="540" w:hanging="271"/>
+      </w:pPr>
+      <w:r>
+        <w:t>Select Add Contractor.</w:t>
+      </w:r>
+    </w:p>
+    <w:p>
+      <w:pPr>
+        <w:pStyle w:val="ListNumber"/>
+        <w:numPr>
+          <w:ilvl w:val="0"/>
+          <w:numId w:val="11"/>
+        </w:numPr>
+        <w:spacing w:after="80" w:line="300" w:lineRule="auto"/>
+        <w:ind w:left="540" w:hanging="271"/>
+      </w:pPr>
+      <w:r>
+        <w:t>Enter the company, contact details, services, accreditation notes and status.</w:t>
+      </w:r>
+    </w:p>
+    <w:p>
+      <w:pPr>
+        <w:pStyle w:val="ListNumber"/>
+        <w:numPr>
+          <w:ilvl w:val="0"/>
+          <w:numId w:val="11"/>
+        </w:numPr>
+        <w:spacing w:after="80" w:line="300" w:lineRule="auto"/>
+        <w:ind w:left="540" w:hanging="271"/>
+      </w:pPr>
+      <w:r>
+        <w:t>Mark the contractor as preferred if appropriate.</w:t>
+      </w:r>
+    </w:p>
+    <w:p>
+      <w:pPr>
+        <w:pStyle w:val="ListNumber"/>
+        <w:numPr>
+          <w:ilvl w:val="0"/>
+          <w:numId w:val="11"/>
+        </w:numPr>
+        <w:spacing w:after="80" w:line="300" w:lineRule="auto"/>
+        <w:ind w:left="540" w:hanging="271"/>
+      </w:pPr>
+      <w:r>
+        <w:t>Save the contractor, then link it to assets, tasks, tickets or contracts.</w:t>
+      </w:r>
+    </w:p>
+    <w:p>
+      <w:pPr>
+        <w:keepNext/>
+      </w:pPr>
       <w:r>
         <w:drawing>
           <wp:inline xmlns:a="http://schemas.openxmlformats.org/drawingml/2006/main" xmlns:pic="http://schemas.openxmlformats.org/drawingml/2006/picture">
             <wp:extent cx="5943600" cy="4127500"/>
-            <wp:docPr id="3" name="Picture 3"/>
+            <wp:docPr id="3" name="Picture 3" descr="Add Contractor form for supplier, maintainer and inspector records." title="Add Contractor form for supplier, maintainer and inspector records."/>
             <wp:cNvGraphicFramePr>
               <a:graphicFrameLocks noChangeAspect="1"/>
             </wp:cNvGraphicFramePr>
@@ -319,7 +430,7 @@
               <a:graphicData uri="http://schemas.openxmlformats.org/drawingml/2006/picture">
                 <pic:pic>
                   <pic:nvPicPr>
-                    <pic:cNvPr id="0" name="02-linked-asset-detail.png"/>
+                    <pic:cNvPr id="0" name="04-add-contractor-form.png"/>
                     <pic:cNvPicPr/>
                   </pic:nvPicPr>
                   <pic:blipFill>
@@ -344,116 +455,7 @@
     </w:p>
     <w:p>
       <w:pPr>
-        <w:jc w:val="center"/>
-      </w:pPr>
-      <w:r>
-        <w:rPr>
-          <w:color w:val="555555"/>
-          <w:sz w:val="18"/>
-        </w:rPr>
-        <w:t>Asset detail showing supplier/maintainer links and related activity.</w:t>
-      </w:r>
-    </w:p>
-    <w:p>
-      <w:pPr>
-        <w:pStyle w:val="Heading1"/>
-      </w:pPr>
-      <w:r>
-        <w:rPr>
-          <w:rFonts w:ascii="Calibri" w:hAnsi="Calibri"/>
-          <w:color w:val="2E74B5"/>
-        </w:rPr>
-        <w:t>3. Add a Contractor</w:t>
-      </w:r>
-    </w:p>
-    <w:p>
-      <w:pPr>
-        <w:pStyle w:val="ListNumber"/>
-        <w:spacing w:after="80" w:line="300" w:lineRule="auto"/>
-        <w:ind w:left="540" w:hanging="271"/>
-      </w:pPr>
-      <w:r>
-        <w:t>Open Estates → Contractors.</w:t>
-      </w:r>
-    </w:p>
-    <w:p>
-      <w:pPr>
-        <w:pStyle w:val="ListNumber"/>
-        <w:spacing w:after="80" w:line="300" w:lineRule="auto"/>
-        <w:ind w:left="540" w:hanging="271"/>
-      </w:pPr>
-      <w:r>
-        <w:t>Select Add Contractor.</w:t>
-      </w:r>
-    </w:p>
-    <w:p>
-      <w:pPr>
-        <w:pStyle w:val="ListNumber"/>
-        <w:spacing w:after="80" w:line="300" w:lineRule="auto"/>
-        <w:ind w:left="540" w:hanging="271"/>
-      </w:pPr>
-      <w:r>
-        <w:t>Enter the company, contact details, services, accreditation notes and status.</w:t>
-      </w:r>
-    </w:p>
-    <w:p>
-      <w:pPr>
-        <w:pStyle w:val="ListNumber"/>
-        <w:spacing w:after="80" w:line="300" w:lineRule="auto"/>
-        <w:ind w:left="540" w:hanging="271"/>
-      </w:pPr>
-      <w:r>
-        <w:t>Mark the contractor as preferred if appropriate.</w:t>
-      </w:r>
-    </w:p>
-    <w:p>
-      <w:pPr>
-        <w:pStyle w:val="ListNumber"/>
-        <w:spacing w:after="80" w:line="300" w:lineRule="auto"/>
-        <w:ind w:left="540" w:hanging="271"/>
-      </w:pPr>
-      <w:r>
-        <w:t>Save the contractor, then link it to assets, tasks, tickets or contracts.</w:t>
-      </w:r>
-    </w:p>
-    <w:p>
-      <w:r>
-        <w:drawing>
-          <wp:inline xmlns:a="http://schemas.openxmlformats.org/drawingml/2006/main" xmlns:pic="http://schemas.openxmlformats.org/drawingml/2006/picture">
-            <wp:extent cx="5943600" cy="4127500"/>
-            <wp:docPr id="4" name="Picture 4"/>
-            <wp:cNvGraphicFramePr>
-              <a:graphicFrameLocks noChangeAspect="1"/>
-            </wp:cNvGraphicFramePr>
-            <a:graphic>
-              <a:graphicData uri="http://schemas.openxmlformats.org/drawingml/2006/picture">
-                <pic:pic>
-                  <pic:nvPicPr>
-                    <pic:cNvPr id="0" name="04-add-contractor-form.png"/>
-                    <pic:cNvPicPr/>
-                  </pic:nvPicPr>
-                  <pic:blipFill>
-                    <a:blip r:embed="rId12"/>
-                    <a:stretch>
-                      <a:fillRect/>
-                    </a:stretch>
-                  </pic:blipFill>
-                  <pic:spPr>
-                    <a:xfrm>
-                      <a:off x="0" y="0"/>
-                      <a:ext cx="5943600" cy="4127500"/>
-                    </a:xfrm>
-                    <a:prstGeom prst="rect"/>
-                  </pic:spPr>
-                </pic:pic>
-              </a:graphicData>
-            </a:graphic>
-          </wp:inline>
-        </w:drawing>
-      </w:r>
-    </w:p>
-    <w:p>
-      <w:pPr>
+        <w:spacing w:after="160"/>
         <w:jc w:val="center"/>
       </w:pPr>
       <w:r>
@@ -481,41 +483,31 @@
         <w:t>Use the asset record to decide which compliance checks apply to that item. For example, a shower can be linked to weekly outlet flushing, while an extinguisher can be linked to fire safety checks. Once linked, the check page shows the asset under Assets covered.</w:t>
       </w:r>
     </w:p>
-    <w:tbl>
-      <w:tblPr>
-        <w:tblW w:type="auto" w:w="0"/>
-        <w:tblLayout w:type="fixed"/>
-        <w:tblLook w:firstColumn="1" w:firstRow="1" w:lastColumn="0" w:lastRow="0" w:noHBand="0" w:noVBand="1" w:val="04A0"/>
-      </w:tblPr>
-      <w:tblGrid>
-        <w:gridCol w:w="9360"/>
-      </w:tblGrid>
-      <w:tr>
-        <w:tc>
-          <w:tcPr>
-            <w:tcW w:type="dxa" w:w="9360"/>
-            <w:shd w:fill="F4F6F9"/>
-          </w:tcPr>
-          <w:p>
-            <w:pPr>
-              <w:spacing w:after="80"/>
-            </w:pPr>
-            <w:r>
-              <w:rPr>
-                <w:b/>
-                <w:color w:val="0B2545"/>
-              </w:rPr>
-              <w:t>Good practice</w:t>
-            </w:r>
-            <w:r>
-              <w:br/>
-              <w:t>Do not delete old assets when they are replaced if their history is needed. Retire or dispose of the old asset, add the new one, then print a new QR label for the replacement.</w:t>
-            </w:r>
-          </w:p>
-        </w:tc>
-      </w:tr>
-    </w:tbl>
-    <w:p/>
+    <w:p>
+      <w:pPr>
+        <w:keepLines/>
+        <w:spacing w:before="120" w:after="200"/>
+        <w:ind w:left="72" w:right="72"/>
+        <w:shd w:fill="F4F6F9"/>
+        <w:pBdr>
+          <w:top w:val="single" w:sz="6" w:space="8" w:color="D0D7DE"/>
+          <w:left w:val="single" w:sz="6" w:space="8" w:color="D0D7DE"/>
+          <w:bottom w:val="single" w:sz="6" w:space="8" w:color="D0D7DE"/>
+          <w:right w:val="single" w:sz="6" w:space="8" w:color="D0D7DE"/>
+        </w:pBdr>
+      </w:pPr>
+      <w:r>
+        <w:rPr>
+          <w:b/>
+          <w:color w:val="0B2545"/>
+        </w:rPr>
+        <w:t>Good practice</w:t>
+      </w:r>
+      <w:r>
+        <w:br/>
+        <w:t>Do not delete old assets when they are replaced if their history is needed. Retire or dispose of the old asset, add the new one, then print a new QR label for the replacement.</w:t>
+      </w:r>
+    </w:p>
     <w:p>
       <w:pPr>
         <w:pStyle w:val="Heading1"/>
@@ -531,6 +523,10 @@
     <w:p>
       <w:pPr>
         <w:pStyle w:val="ListNumber"/>
+        <w:numPr>
+          <w:ilvl w:val="0"/>
+          <w:numId w:val="12"/>
+        </w:numPr>
         <w:spacing w:after="80" w:line="300" w:lineRule="auto"/>
         <w:ind w:left="540" w:hanging="271"/>
       </w:pPr>
@@ -541,6 +537,10 @@
     <w:p>
       <w:pPr>
         <w:pStyle w:val="ListNumber"/>
+        <w:numPr>
+          <w:ilvl w:val="0"/>
+          <w:numId w:val="12"/>
+        </w:numPr>
         <w:spacing w:after="80" w:line="300" w:lineRule="auto"/>
         <w:ind w:left="540" w:hanging="271"/>
       </w:pPr>
@@ -551,6 +551,10 @@
     <w:p>
       <w:pPr>
         <w:pStyle w:val="ListNumber"/>
+        <w:numPr>
+          <w:ilvl w:val="0"/>
+          <w:numId w:val="12"/>
+        </w:numPr>
         <w:spacing w:after="80" w:line="300" w:lineRule="auto"/>
         <w:ind w:left="540" w:hanging="271"/>
       </w:pPr>
@@ -561,6 +565,10 @@
     <w:p>
       <w:pPr>
         <w:pStyle w:val="ListNumber"/>
+        <w:numPr>
+          <w:ilvl w:val="0"/>
+          <w:numId w:val="12"/>
+        </w:numPr>
         <w:spacing w:after="80" w:line="300" w:lineRule="auto"/>
         <w:ind w:left="540" w:hanging="271"/>
       </w:pPr>
@@ -571,6 +579,10 @@
     <w:p>
       <w:pPr>
         <w:pStyle w:val="ListNumber"/>
+        <w:numPr>
+          <w:ilvl w:val="0"/>
+          <w:numId w:val="12"/>
+        </w:numPr>
         <w:spacing w:after="80" w:line="300" w:lineRule="auto"/>
         <w:ind w:left="540" w:hanging="271"/>
       </w:pPr>
@@ -581,6 +593,10 @@
     <w:p>
       <w:pPr>
         <w:pStyle w:val="ListNumber"/>
+        <w:numPr>
+          <w:ilvl w:val="0"/>
+          <w:numId w:val="12"/>
+        </w:numPr>
         <w:spacing w:after="80" w:line="300" w:lineRule="auto"/>
         <w:ind w:left="540" w:hanging="271"/>
       </w:pPr>
@@ -591,11 +607,278 @@
     <w:p>
       <w:pPr>
         <w:pStyle w:val="ListNumber"/>
+        <w:numPr>
+          <w:ilvl w:val="0"/>
+          <w:numId w:val="12"/>
+        </w:numPr>
         <w:spacing w:after="80" w:line="300" w:lineRule="auto"/>
         <w:ind w:left="540" w:hanging="271"/>
       </w:pPr>
       <w:r>
         <w:t>Save the completion and review the Completion history section.</w:t>
+      </w:r>
+    </w:p>
+    <w:p>
+      <w:pPr>
+        <w:keepLines/>
+        <w:spacing w:before="120" w:after="200"/>
+        <w:ind w:left="72" w:right="72"/>
+        <w:shd w:fill="E8F5F1"/>
+        <w:pBdr>
+          <w:top w:val="single" w:sz="6" w:space="8" w:color="D0D7DE"/>
+          <w:left w:val="single" w:sz="6" w:space="8" w:color="D0D7DE"/>
+          <w:bottom w:val="single" w:sz="6" w:space="8" w:color="D0D7DE"/>
+          <w:right w:val="single" w:sz="6" w:space="8" w:color="D0D7DE"/>
+        </w:pBdr>
+      </w:pPr>
+      <w:r>
+        <w:rPr>
+          <w:b/>
+          <w:color w:val="0B2545"/>
+        </w:rPr>
+        <w:t>How to prove the record is stored</w:t>
+      </w:r>
+      <w:r>
+        <w:br/>
+        <w:t>Return to the domain list and confirm the check shows Completed. Reopen it, verify the next due date, notes and evidence in Completion history, open the evidence file, then reload the page and confirm the same information remains.</w:t>
+      </w:r>
+    </w:p>
+    <w:p>
+      <w:r>
+        <w:t>The system calculates the next due date from the recurrence. In the Rawdon acceptance test, the private non-statutory DEMO - Monthly Site Security Walkround was completed on 30 July 2026 and automatically moved to 30 August 2026.</w:t>
+      </w:r>
+    </w:p>
+    <w:p>
+      <w:pPr>
+        <w:keepNext/>
+      </w:pPr>
+      <w:r>
+        <w:drawing>
+          <wp:inline xmlns:a="http://schemas.openxmlformats.org/drawingml/2006/main" xmlns:pic="http://schemas.openxmlformats.org/drawingml/2006/picture">
+            <wp:extent cx="5943600" cy="3245394"/>
+            <wp:docPr id="4" name="Picture 4" descr="The completed monthly demo check is visible in the Security domain list." title="The completed monthly demo check is visible in the Security domain list."/>
+            <wp:cNvGraphicFramePr>
+              <a:graphicFrameLocks noChangeAspect="1"/>
+            </wp:cNvGraphicFramePr>
+            <a:graphic>
+              <a:graphicData uri="http://schemas.openxmlformats.org/drawingml/2006/picture">
+                <pic:pic>
+                  <pic:nvPicPr>
+                    <pic:cNvPr id="0" name="11-rawdon-demo-check-in-list.png"/>
+                    <pic:cNvPicPr/>
+                  </pic:nvPicPr>
+                  <pic:blipFill>
+                    <a:blip r:embed="rId12"/>
+                    <a:stretch>
+                      <a:fillRect/>
+                    </a:stretch>
+                  </pic:blipFill>
+                  <pic:spPr>
+                    <a:xfrm>
+                      <a:off x="0" y="0"/>
+                      <a:ext cx="5943600" cy="3245394"/>
+                    </a:xfrm>
+                    <a:prstGeom prst="rect"/>
+                  </pic:spPr>
+                </pic:pic>
+              </a:graphicData>
+            </a:graphic>
+          </wp:inline>
+        </w:drawing>
+      </w:r>
+    </w:p>
+    <w:p>
+      <w:pPr>
+        <w:spacing w:after="160"/>
+        <w:jc w:val="center"/>
+      </w:pPr>
+      <w:r>
+        <w:rPr>
+          <w:color w:val="555555"/>
+          <w:sz w:val="18"/>
+        </w:rPr>
+        <w:t>The completed monthly demo check is visible in the Security domain list.</w:t>
+      </w:r>
+    </w:p>
+    <w:p>
+      <w:pPr>
+        <w:keepNext/>
+      </w:pPr>
+      <w:r>
+        <w:drawing>
+          <wp:inline xmlns:a="http://schemas.openxmlformats.org/drawingml/2006/main" xmlns:pic="http://schemas.openxmlformats.org/drawingml/2006/picture">
+            <wp:extent cx="5943600" cy="3245394"/>
+            <wp:docPr id="5" name="Picture 5" descr="The reopened check shows Fully Completed and the next due date of 30 August 2026." title="The reopened check shows Fully Completed and the next due date of 30 August 2026."/>
+            <wp:cNvGraphicFramePr>
+              <a:graphicFrameLocks noChangeAspect="1"/>
+            </wp:cNvGraphicFramePr>
+            <a:graphic>
+              <a:graphicData uri="http://schemas.openxmlformats.org/drawingml/2006/picture">
+                <pic:pic>
+                  <pic:nvPicPr>
+                    <pic:cNvPr id="0" name="08-rawdon-demo-check-completed.png"/>
+                    <pic:cNvPicPr/>
+                  </pic:nvPicPr>
+                  <pic:blipFill>
+                    <a:blip r:embed="rId13"/>
+                    <a:stretch>
+                      <a:fillRect/>
+                    </a:stretch>
+                  </pic:blipFill>
+                  <pic:spPr>
+                    <a:xfrm>
+                      <a:off x="0" y="0"/>
+                      <a:ext cx="5943600" cy="3245394"/>
+                    </a:xfrm>
+                    <a:prstGeom prst="rect"/>
+                  </pic:spPr>
+                </pic:pic>
+              </a:graphicData>
+            </a:graphic>
+          </wp:inline>
+        </w:drawing>
+      </w:r>
+    </w:p>
+    <w:p>
+      <w:pPr>
+        <w:spacing w:after="160"/>
+        <w:jc w:val="center"/>
+      </w:pPr>
+      <w:r>
+        <w:rPr>
+          <w:color w:val="555555"/>
+          <w:sz w:val="18"/>
+        </w:rPr>
+        <w:t>The reopened check shows Fully Completed and the next due date of 30 August 2026.</w:t>
+      </w:r>
+    </w:p>
+    <w:p>
+      <w:pPr>
+        <w:keepNext/>
+      </w:pPr>
+      <w:r>
+        <w:drawing>
+          <wp:inline xmlns:a="http://schemas.openxmlformats.org/drawingml/2006/main" xmlns:pic="http://schemas.openxmlformats.org/drawingml/2006/picture">
+            <wp:extent cx="5943600" cy="3245394"/>
+            <wp:docPr id="6" name="Picture 6" descr="Completion history retains the date, person, notes, next due date and linked image." title="Completion history retains the date, person, notes, next due date and linked image."/>
+            <wp:cNvGraphicFramePr>
+              <a:graphicFrameLocks noChangeAspect="1"/>
+            </wp:cNvGraphicFramePr>
+            <a:graphic>
+              <a:graphicData uri="http://schemas.openxmlformats.org/drawingml/2006/picture">
+                <pic:pic>
+                  <pic:nvPicPr>
+                    <pic:cNvPr id="0" name="09-rawdon-demo-history-and-image.png"/>
+                    <pic:cNvPicPr/>
+                  </pic:nvPicPr>
+                  <pic:blipFill>
+                    <a:blip r:embed="rId14"/>
+                    <a:stretch>
+                      <a:fillRect/>
+                    </a:stretch>
+                  </pic:blipFill>
+                  <pic:spPr>
+                    <a:xfrm>
+                      <a:off x="0" y="0"/>
+                      <a:ext cx="5943600" cy="3245394"/>
+                    </a:xfrm>
+                    <a:prstGeom prst="rect"/>
+                  </pic:spPr>
+                </pic:pic>
+              </a:graphicData>
+            </a:graphic>
+          </wp:inline>
+        </w:drawing>
+      </w:r>
+    </w:p>
+    <w:p>
+      <w:pPr>
+        <w:spacing w:after="160"/>
+        <w:jc w:val="center"/>
+      </w:pPr>
+      <w:r>
+        <w:rPr>
+          <w:color w:val="555555"/>
+          <w:sz w:val="18"/>
+        </w:rPr>
+        <w:t>Completion history retains the date, person, notes, next due date and linked image.</w:t>
+      </w:r>
+    </w:p>
+    <w:p>
+      <w:pPr>
+        <w:keepNext/>
+      </w:pPr>
+      <w:r>
+        <w:drawing>
+          <wp:inline xmlns:a="http://schemas.openxmlformats.org/drawingml/2006/main" xmlns:pic="http://schemas.openxmlformats.org/drawingml/2006/picture">
+            <wp:extent cx="5943600" cy="3050143"/>
+            <wp:docPr id="7" name="Picture 7" descr="The saved image opens from the completion history." title="The saved image opens from the completion history."/>
+            <wp:cNvGraphicFramePr>
+              <a:graphicFrameLocks noChangeAspect="1"/>
+            </wp:cNvGraphicFramePr>
+            <a:graphic>
+              <a:graphicData uri="http://schemas.openxmlformats.org/drawingml/2006/picture">
+                <pic:pic>
+                  <pic:nvPicPr>
+                    <pic:cNvPr id="0" name="10-rawdon-demo-evidence-open.png"/>
+                    <pic:cNvPicPr/>
+                  </pic:nvPicPr>
+                  <pic:blipFill>
+                    <a:blip r:embed="rId15"/>
+                    <a:stretch>
+                      <a:fillRect/>
+                    </a:stretch>
+                  </pic:blipFill>
+                  <pic:spPr>
+                    <a:xfrm>
+                      <a:off x="0" y="0"/>
+                      <a:ext cx="5943600" cy="3050143"/>
+                    </a:xfrm>
+                    <a:prstGeom prst="rect"/>
+                  </pic:spPr>
+                </pic:pic>
+              </a:graphicData>
+            </a:graphic>
+          </wp:inline>
+        </w:drawing>
+      </w:r>
+    </w:p>
+    <w:p>
+      <w:pPr>
+        <w:spacing w:after="160"/>
+        <w:jc w:val="center"/>
+      </w:pPr>
+      <w:r>
+        <w:rPr>
+          <w:color w:val="555555"/>
+          <w:sz w:val="18"/>
+        </w:rPr>
+        <w:t>The saved image opens from the completion history.</w:t>
+      </w:r>
+    </w:p>
+    <w:p>
+      <w:pPr>
+        <w:keepLines/>
+        <w:spacing w:before="120" w:after="200"/>
+        <w:ind w:left="72" w:right="72"/>
+        <w:shd w:fill="FFF2CC"/>
+        <w:pBdr>
+          <w:top w:val="single" w:sz="6" w:space="8" w:color="D0D7DE"/>
+          <w:left w:val="single" w:sz="6" w:space="8" w:color="D0D7DE"/>
+          <w:bottom w:val="single" w:sz="6" w:space="8" w:color="D0D7DE"/>
+          <w:right w:val="single" w:sz="6" w:space="8" w:color="D0D7DE"/>
+        </w:pBdr>
+      </w:pPr>
+      <w:r>
+        <w:rPr>
+          <w:b/>
+          <w:color w:val="0B2545"/>
+        </w:rPr>
+        <w:t>Customer-data guardrail</w:t>
+      </w:r>
+      <w:r>
+        <w:br/>
+        <w:t>Use a clearly labelled private demo check for demonstrations. Do not mark a real statutory check complete unless the school has genuinely completed it and the evidence is accurate. Use Aurora Primary to demonstrate invented failures and automatic tickets.</w:t>
       </w:r>
     </w:p>
     <w:p>
@@ -613,6 +896,10 @@
     <w:p>
       <w:pPr>
         <w:pStyle w:val="ListNumber"/>
+        <w:numPr>
+          <w:ilvl w:val="0"/>
+          <w:numId w:val="13"/>
+        </w:numPr>
         <w:spacing w:after="80" w:line="300" w:lineRule="auto"/>
         <w:ind w:left="540" w:hanging="271"/>
       </w:pPr>
@@ -623,6 +910,10 @@
     <w:p>
       <w:pPr>
         <w:pStyle w:val="ListNumber"/>
+        <w:numPr>
+          <w:ilvl w:val="0"/>
+          <w:numId w:val="13"/>
+        </w:numPr>
         <w:spacing w:after="80" w:line="300" w:lineRule="auto"/>
         <w:ind w:left="540" w:hanging="271"/>
       </w:pPr>
@@ -633,6 +924,10 @@
     <w:p>
       <w:pPr>
         <w:pStyle w:val="ListNumber"/>
+        <w:numPr>
+          <w:ilvl w:val="0"/>
+          <w:numId w:val="13"/>
+        </w:numPr>
         <w:spacing w:after="80" w:line="300" w:lineRule="auto"/>
         <w:ind w:left="540" w:hanging="271"/>
       </w:pPr>
@@ -643,6 +938,10 @@
     <w:p>
       <w:pPr>
         <w:pStyle w:val="ListNumber"/>
+        <w:numPr>
+          <w:ilvl w:val="0"/>
+          <w:numId w:val="13"/>
+        </w:numPr>
         <w:spacing w:after="80" w:line="300" w:lineRule="auto"/>
         <w:ind w:left="540" w:hanging="271"/>
       </w:pPr>
@@ -653,6 +952,10 @@
     <w:p>
       <w:pPr>
         <w:pStyle w:val="ListNumber"/>
+        <w:numPr>
+          <w:ilvl w:val="0"/>
+          <w:numId w:val="13"/>
+        </w:numPr>
         <w:spacing w:after="80" w:line="300" w:lineRule="auto"/>
         <w:ind w:left="540" w:hanging="271"/>
       </w:pPr>
@@ -663,6 +966,10 @@
     <w:p>
       <w:pPr>
         <w:pStyle w:val="ListNumber"/>
+        <w:numPr>
+          <w:ilvl w:val="0"/>
+          <w:numId w:val="13"/>
+        </w:numPr>
         <w:spacing w:after="80" w:line="300" w:lineRule="auto"/>
         <w:ind w:left="540" w:hanging="271"/>
       </w:pPr>
@@ -676,11 +983,14 @@
       </w:r>
     </w:p>
     <w:p>
+      <w:pPr>
+        <w:keepNext/>
+      </w:pPr>
       <w:r>
         <w:drawing>
           <wp:inline xmlns:a="http://schemas.openxmlformats.org/drawingml/2006/main" xmlns:pic="http://schemas.openxmlformats.org/drawingml/2006/picture">
             <wp:extent cx="5943600" cy="4127500"/>
-            <wp:docPr id="5" name="Picture 5"/>
+            <wp:docPr id="8" name="Picture 8" descr="New ticket opened from a compliance check with the check context preserved." title="New ticket opened from a compliance check with the check context preserved."/>
             <wp:cNvGraphicFramePr>
               <a:graphicFrameLocks noChangeAspect="1"/>
             </wp:cNvGraphicFramePr>
@@ -692,7 +1002,7 @@
                     <pic:cNvPicPr/>
                   </pic:nvPicPr>
                   <pic:blipFill>
-                    <a:blip r:embed="rId13"/>
+                    <a:blip r:embed="rId16"/>
                     <a:stretch>
                       <a:fillRect/>
                     </a:stretch>
@@ -713,6 +1023,7 @@
     </w:p>
     <w:p>
       <w:pPr>
+        <w:spacing w:after="160"/>
         <w:jc w:val="center"/>
       </w:pPr>
       <w:r>
@@ -738,6 +1049,10 @@
     <w:p>
       <w:pPr>
         <w:pStyle w:val="ListNumber"/>
+        <w:numPr>
+          <w:ilvl w:val="0"/>
+          <w:numId w:val="14"/>
+        </w:numPr>
         <w:spacing w:after="80" w:line="300" w:lineRule="auto"/>
         <w:ind w:left="540" w:hanging="271"/>
       </w:pPr>
@@ -748,6 +1063,10 @@
     <w:p>
       <w:pPr>
         <w:pStyle w:val="ListNumber"/>
+        <w:numPr>
+          <w:ilvl w:val="0"/>
+          <w:numId w:val="14"/>
+        </w:numPr>
         <w:spacing w:after="80" w:line="300" w:lineRule="auto"/>
         <w:ind w:left="540" w:hanging="271"/>
       </w:pPr>
@@ -758,6 +1077,10 @@
     <w:p>
       <w:pPr>
         <w:pStyle w:val="ListNumber"/>
+        <w:numPr>
+          <w:ilvl w:val="0"/>
+          <w:numId w:val="14"/>
+        </w:numPr>
         <w:spacing w:after="80" w:line="300" w:lineRule="auto"/>
         <w:ind w:left="540" w:hanging="271"/>
       </w:pPr>
@@ -768,6 +1091,10 @@
     <w:p>
       <w:pPr>
         <w:pStyle w:val="ListNumber"/>
+        <w:numPr>
+          <w:ilvl w:val="0"/>
+          <w:numId w:val="14"/>
+        </w:numPr>
         <w:spacing w:after="80" w:line="300" w:lineRule="auto"/>
         <w:ind w:left="540" w:hanging="271"/>
       </w:pPr>
@@ -778,6 +1105,10 @@
     <w:p>
       <w:pPr>
         <w:pStyle w:val="ListNumber"/>
+        <w:numPr>
+          <w:ilvl w:val="0"/>
+          <w:numId w:val="14"/>
+        </w:numPr>
         <w:spacing w:after="80" w:line="300" w:lineRule="auto"/>
         <w:ind w:left="540" w:hanging="271"/>
       </w:pPr>
@@ -788,6 +1119,10 @@
     <w:p>
       <w:pPr>
         <w:pStyle w:val="ListNumber"/>
+        <w:numPr>
+          <w:ilvl w:val="0"/>
+          <w:numId w:val="14"/>
+        </w:numPr>
         <w:spacing w:after="80" w:line="300" w:lineRule="auto"/>
         <w:ind w:left="540" w:hanging="271"/>
       </w:pPr>
@@ -798,6 +1133,10 @@
     <w:p>
       <w:pPr>
         <w:pStyle w:val="ListNumber"/>
+        <w:numPr>
+          <w:ilvl w:val="0"/>
+          <w:numId w:val="14"/>
+        </w:numPr>
         <w:spacing w:after="80" w:line="300" w:lineRule="auto"/>
         <w:ind w:left="540" w:hanging="271"/>
       </w:pPr>
@@ -806,11 +1145,14 @@
       </w:r>
     </w:p>
     <w:p>
+      <w:pPr>
+        <w:keepNext/>
+      </w:pPr>
       <w:r>
         <w:drawing>
           <wp:inline xmlns:a="http://schemas.openxmlformats.org/drawingml/2006/main" xmlns:pic="http://schemas.openxmlformats.org/drawingml/2006/picture">
-            <wp:extent cx="5943600" cy="4127500"/>
-            <wp:docPr id="6" name="Picture 6"/>
+            <wp:extent cx="5120640" cy="3556000"/>
+            <wp:docPr id="9" name="Picture 9" descr="Custom check wizard with statutory/non-statutory classification." title="Custom check wizard with statutory/non-statutory classification."/>
             <wp:cNvGraphicFramePr>
               <a:graphicFrameLocks noChangeAspect="1"/>
             </wp:cNvGraphicFramePr>
@@ -822,7 +1164,7 @@
                     <pic:cNvPicPr/>
                   </pic:nvPicPr>
                   <pic:blipFill>
-                    <a:blip r:embed="rId14"/>
+                    <a:blip r:embed="rId17"/>
                     <a:stretch>
                       <a:fillRect/>
                     </a:stretch>
@@ -830,7 +1172,7 @@
                   <pic:spPr>
                     <a:xfrm>
                       <a:off x="0" y="0"/>
-                      <a:ext cx="5943600" cy="4127500"/>
+                      <a:ext cx="5120640" cy="3556000"/>
                     </a:xfrm>
                     <a:prstGeom prst="rect"/>
                   </pic:spPr>
@@ -843,6 +1185,7 @@
     </w:p>
     <w:p>
       <w:pPr>
+        <w:spacing w:after="160"/>
         <w:jc w:val="center"/>
       </w:pPr>
       <w:r>
@@ -854,88 +1197,30 @@
       </w:r>
     </w:p>
     <w:p>
-      <w:r>
-        <w:drawing>
-          <wp:inline xmlns:a="http://schemas.openxmlformats.org/drawingml/2006/main" xmlns:pic="http://schemas.openxmlformats.org/drawingml/2006/picture">
-            <wp:extent cx="5943600" cy="4127500"/>
-            <wp:docPr id="7" name="Picture 7"/>
-            <wp:cNvGraphicFramePr>
-              <a:graphicFrameLocks noChangeAspect="1"/>
-            </wp:cNvGraphicFramePr>
-            <a:graphic>
-              <a:graphicData uri="http://schemas.openxmlformats.org/drawingml/2006/picture">
-                <pic:pic>
-                  <pic:nvPicPr>
-                    <pic:cNvPr id="0" name="07-fire-domain-custom-check.png"/>
-                    <pic:cNvPicPr/>
-                  </pic:nvPicPr>
-                  <pic:blipFill>
-                    <a:blip r:embed="rId15"/>
-                    <a:stretch>
-                      <a:fillRect/>
-                    </a:stretch>
-                  </pic:blipFill>
-                  <pic:spPr>
-                    <a:xfrm>
-                      <a:off x="0" y="0"/>
-                      <a:ext cx="5943600" cy="4127500"/>
-                    </a:xfrm>
-                    <a:prstGeom prst="rect"/>
-                  </pic:spPr>
-                </pic:pic>
-              </a:graphicData>
-            </a:graphic>
-          </wp:inline>
-        </w:drawing>
-      </w:r>
-    </w:p>
-    <w:p>
       <w:pPr>
-        <w:jc w:val="center"/>
+        <w:keepLines/>
+        <w:spacing w:before="120" w:after="200"/>
+        <w:ind w:left="72" w:right="72"/>
+        <w:shd w:fill="FFF2CC"/>
+        <w:pBdr>
+          <w:top w:val="single" w:sz="6" w:space="8" w:color="D0D7DE"/>
+          <w:left w:val="single" w:sz="6" w:space="8" w:color="D0D7DE"/>
+          <w:bottom w:val="single" w:sz="6" w:space="8" w:color="D0D7DE"/>
+          <w:right w:val="single" w:sz="6" w:space="8" w:color="D0D7DE"/>
+        </w:pBdr>
       </w:pPr>
       <w:r>
         <w:rPr>
-          <w:color w:val="555555"/>
-          <w:sz w:val="18"/>
+          <w:b/>
+          <w:color w:val="0B2545"/>
         </w:rPr>
-        <w:t>Fire Safety domain showing a school-created check.</w:t>
+        <w:t>Statutory frequency rule</w:t>
+      </w:r>
+      <w:r>
+        <w:br/>
+        <w:t>Statutory frequencies are not school preferences. They should come from the regulation, approved strategy, or Schoolgle-managed statutory check library. School-created statutory checks are frequency-locked once saved.</w:t>
       </w:r>
     </w:p>
-    <w:tbl>
-      <w:tblPr>
-        <w:tblW w:type="auto" w:w="0"/>
-        <w:tblLayout w:type="fixed"/>
-        <w:tblLook w:firstColumn="1" w:firstRow="1" w:lastColumn="0" w:lastRow="0" w:noHBand="0" w:noVBand="1" w:val="04A0"/>
-      </w:tblPr>
-      <w:tblGrid>
-        <w:gridCol w:w="9360"/>
-      </w:tblGrid>
-      <w:tr>
-        <w:tc>
-          <w:tcPr>
-            <w:tcW w:type="dxa" w:w="9360"/>
-            <w:shd w:fill="FFF2CC"/>
-          </w:tcPr>
-          <w:p>
-            <w:pPr>
-              <w:spacing w:after="80"/>
-            </w:pPr>
-            <w:r>
-              <w:rPr>
-                <w:b/>
-                <w:color w:val="0B2545"/>
-              </w:rPr>
-              <w:t>Statutory frequency rule</w:t>
-            </w:r>
-            <w:r>
-              <w:br/>
-              <w:t>Statutory frequencies are not school preferences. They should come from the regulation, approved strategy, or Schoolgle-managed statutory check library. School-created statutory checks are frequency-locked once saved.</w:t>
-            </w:r>
-          </w:p>
-        </w:tc>
-      </w:tr>
-    </w:tbl>
-    <w:p/>
     <w:p>
       <w:pPr>
         <w:pStyle w:val="Heading1"/>
@@ -1028,8 +1313,38 @@
         <w:t>Create a non-statutory school check and confirm it appears in the relevant domain.</w:t>
       </w:r>
     </w:p>
+    <w:p>
+      <w:pPr>
+        <w:pStyle w:val="ListBullet"/>
+        <w:spacing w:after="80" w:line="300" w:lineRule="auto"/>
+        <w:ind w:left="540" w:hanging="271"/>
+      </w:pPr>
+      <w:r>
+        <w:t>Complete a clearly labelled monthly demo check, then confirm the next due date advances by one month.</w:t>
+      </w:r>
+    </w:p>
+    <w:p>
+      <w:pPr>
+        <w:pStyle w:val="ListBullet"/>
+        <w:spacing w:after="80" w:line="300" w:lineRule="auto"/>
+        <w:ind w:left="540" w:hanging="271"/>
+      </w:pPr>
+      <w:r>
+        <w:t>Leave and reopen the check, then confirm the notes and evidence remain in Completion history.</w:t>
+      </w:r>
+    </w:p>
+    <w:p>
+      <w:pPr>
+        <w:pStyle w:val="ListBullet"/>
+        <w:spacing w:after="80" w:line="300" w:lineRule="auto"/>
+        <w:ind w:left="540" w:hanging="271"/>
+      </w:pPr>
+      <w:r>
+        <w:t>Open the saved image from the completion record.</w:t>
+      </w:r>
+    </w:p>
     <w:sectPr>
-      <w:footerReference w:type="default" r:id="rId16"/>
+      <w:footerReference w:type="default" r:id="rId18"/>
       <w:pgSz w:w="12240" w:h="15840"/>
       <w:pgMar w:top="1440" w:right="1440" w:bottom="1440" w:left="1440" w:header="708" w:footer="708" w:gutter="0"/>
       <w:cols w:space="720"/>
@@ -1256,6 +1571,36 @@
   </w:num>
   <w:num w:numId="9">
     <w:abstractNumId w:val="0"/>
+  </w:num>
+  <w:num w:numId="10">
+    <w:abstractNumId w:val="7"/>
+    <w:lvlOverride w:ilvl="0">
+      <w:startOverride w:val="1"/>
+    </w:lvlOverride>
+  </w:num>
+  <w:num w:numId="11">
+    <w:abstractNumId w:val="7"/>
+    <w:lvlOverride w:ilvl="0">
+      <w:startOverride w:val="1"/>
+    </w:lvlOverride>
+  </w:num>
+  <w:num w:numId="12">
+    <w:abstractNumId w:val="7"/>
+    <w:lvlOverride w:ilvl="0">
+      <w:startOverride w:val="1"/>
+    </w:lvlOverride>
+  </w:num>
+  <w:num w:numId="13">
+    <w:abstractNumId w:val="7"/>
+    <w:lvlOverride w:ilvl="0">
+      <w:startOverride w:val="1"/>
+    </w:lvlOverride>
+  </w:num>
+  <w:num w:numId="14">
+    <w:abstractNumId w:val="7"/>
+    <w:lvlOverride w:ilvl="0">
+      <w:startOverride w:val="1"/>
+    </w:lvlOverride>
   </w:num>
 </w:numbering>
 </file>

</xml_diff>